<commit_message>
Document configurable expense policy settings
</commit_message>
<xml_diff>
--- a/docs/user-guide/대방동지역주택조합_ERP_사용설명서_초안.docx
+++ b/docs/user-guide/대방동지역주택조합_ERP_사용설명서_초안.docx
@@ -10754,37 +10754,536 @@
         <w:pStyle w:val="Heading2"/>
       </w:pPr>
       <w:r>
-        <w:t>17. 규정 시행과 변경</w:t>
-      </w:r>
-    </w:p>
-    <w:p>
-      <w:r>
-        <w:rPr>
-          <w:rFonts w:ascii="Malgun Gothic" w:hAnsi="Malgun Gothic" w:eastAsia="Malgun Gothic"/>
-          <w:b w:val="0"/>
-          <w:color w:val="152238"/>
-          <w:sz w:val="21"/>
-        </w:rPr>
-        <w:t>새 규정은 시행일과 경과조치를 함께 의결한다. 시행 전에 발생한 미정산 건에는 일정한 정리기간을 부여하고 그 이후부터 새 기한을 적용한다. 승인한도, 제출기한, 역할과 예외 기준을 바꾸면 변경일, 의결 근거와 적용 대상을 기록하고 이미 마감한 월에 임의로 소급하지 않는다.</w:t>
-      </w:r>
-    </w:p>
-    <w:p>
-      <w:r>
-        <w:rPr>
-          <w:rFonts w:ascii="Malgun Gothic" w:hAnsi="Malgun Gothic" w:eastAsia="Malgun Gothic"/>
-          <w:b w:val="0"/>
-          <w:color w:val="152238"/>
-          <w:sz w:val="21"/>
-        </w:rPr>
-        <w:t>주택조합은 거래 장부를 월별로 작성하고 증빙서류와 함께 보관해야 한다. ERP의 원본·변경·승인·지급·마감 이력은 이 의무를 지원하기 위한 기록이며, 원본 삭제나 이력 없는 수정을 허용하지 않는다.</w:t>
-      </w:r>
-    </w:p>
-    <w:p>
-      <w:pPr>
-        <w:pStyle w:val="Heading1"/>
-      </w:pPr>
-      <w:r>
-        <w:t>부록. 설명서 업데이트 방법</w:t>
+        <w:t>17. 권장 초기값과 설정모드</w:t>
+      </w:r>
+    </w:p>
+    <w:p>
+      <w:r>
+        <w:rPr>
+          <w:rFonts w:ascii="Malgun Gothic" w:hAnsi="Malgun Gothic" w:eastAsia="Malgun Gothic"/>
+          <w:b w:val="0"/>
+          <w:color w:val="152238"/>
+          <w:sz w:val="21"/>
+        </w:rPr>
+        <w:t xml:space="preserve">ERP에는 아래 값을 </w:t>
+      </w:r>
+      <w:r>
+        <w:rPr>
+          <w:rFonts w:ascii="Malgun Gothic" w:hAnsi="Malgun Gothic" w:eastAsia="Malgun Gothic"/>
+          <w:b/>
+          <w:color w:val="2457C5"/>
+          <w:sz w:val="19"/>
+        </w:rPr>
+        <w:t>추천안·미확정</w:t>
+      </w:r>
+      <w:r>
+        <w:rPr>
+          <w:rFonts w:ascii="Malgun Gothic" w:hAnsi="Malgun Gothic" w:eastAsia="Malgun Gothic"/>
+          <w:b w:val="0"/>
+          <w:color w:val="152238"/>
+          <w:sz w:val="21"/>
+        </w:rPr>
+        <w:t xml:space="preserve"> 상태로 제공한다. 추천값을 불러오는 것만으로는 운영규정이나 진행 중인 신청에 효력이 생기지 않는다. 조합의 계약, 예산규모와 의결사항에 맞게 관리자가 검토·수정하고 다른 승인자가 승인한 뒤 시행일에 활성화한다.</w:t>
+      </w:r>
+    </w:p>
+    <w:p>
+      <w:pPr>
+        <w:pStyle w:val="Heading3"/>
+      </w:pPr>
+      <w:r>
+        <w:t>권장 초기값</w:t>
+      </w:r>
+    </w:p>
+    <w:tbl>
+      <w:tblPr>
+        <w:tblStyle w:val="TableGrid"/>
+        <w:tblW w:type="dxa" w:w="9000"/>
+        <w:jc w:val="center"/>
+        <w:tblLayout w:type="fixed"/>
+        <w:tblLook w:firstColumn="1" w:firstRow="1" w:lastColumn="0" w:lastRow="0" w:noHBand="0" w:noVBand="1" w:val="04A0"/>
+      </w:tblPr>
+      <w:tblGrid>
+        <w:gridCol w:w="1154"/>
+        <w:gridCol w:w="3923"/>
+        <w:gridCol w:w="3923"/>
+      </w:tblGrid>
+      <w:tr>
+        <w:trPr>
+          <w:cantSplit/>
+          <w:tblHeader w:val="true"/>
+        </w:trPr>
+        <w:tc>
+          <w:tcPr>
+            <w:tcW w:type="dxa" w:w="1154"/>
+            <w:tcMar>
+              <w:top w:w="100" w:type="dxa"/>
+              <w:start w:w="130" w:type="dxa"/>
+              <w:bottom w:w="100" w:type="dxa"/>
+              <w:end w:w="130" w:type="dxa"/>
+            </w:tcMar>
+            <w:vAlign w:val="center"/>
+            <w:shd w:fill="2457C5"/>
+          </w:tcPr>
+          <w:p>
+            <w:pPr>
+              <w:spacing w:after="0" w:line="264" w:lineRule="auto"/>
+            </w:pPr>
+            <w:r>
+              <w:rPr>
+                <w:rFonts w:ascii="Malgun Gothic" w:hAnsi="Malgun Gothic" w:eastAsia="Malgun Gothic"/>
+                <w:b/>
+                <w:color w:val="FFFFFF"/>
+                <w:sz w:val="17"/>
+              </w:rPr>
+              <w:t>설정 영역</w:t>
+            </w:r>
+          </w:p>
+        </w:tc>
+        <w:tc>
+          <w:tcPr>
+            <w:tcW w:type="dxa" w:w="3923"/>
+            <w:tcMar>
+              <w:top w:w="100" w:type="dxa"/>
+              <w:start w:w="130" w:type="dxa"/>
+              <w:bottom w:w="100" w:type="dxa"/>
+              <w:end w:w="130" w:type="dxa"/>
+            </w:tcMar>
+            <w:vAlign w:val="center"/>
+            <w:shd w:fill="2457C5"/>
+          </w:tcPr>
+          <w:p>
+            <w:pPr>
+              <w:spacing w:after="0" w:line="264" w:lineRule="auto"/>
+            </w:pPr>
+            <w:r>
+              <w:rPr>
+                <w:rFonts w:ascii="Malgun Gothic" w:hAnsi="Malgun Gothic" w:eastAsia="Malgun Gothic"/>
+                <w:b/>
+                <w:color w:val="FFFFFF"/>
+                <w:sz w:val="17"/>
+              </w:rPr>
+              <w:t>권장값</w:t>
+            </w:r>
+          </w:p>
+        </w:tc>
+        <w:tc>
+          <w:tcPr>
+            <w:tcW w:type="dxa" w:w="3923"/>
+            <w:tcMar>
+              <w:top w:w="100" w:type="dxa"/>
+              <w:start w:w="130" w:type="dxa"/>
+              <w:bottom w:w="100" w:type="dxa"/>
+              <w:end w:w="130" w:type="dxa"/>
+            </w:tcMar>
+            <w:vAlign w:val="center"/>
+            <w:shd w:fill="2457C5"/>
+          </w:tcPr>
+          <w:p>
+            <w:pPr>
+              <w:spacing w:after="0" w:line="264" w:lineRule="auto"/>
+            </w:pPr>
+            <w:r>
+              <w:rPr>
+                <w:rFonts w:ascii="Malgun Gothic" w:hAnsi="Malgun Gothic" w:eastAsia="Malgun Gothic"/>
+                <w:b/>
+                <w:color w:val="FFFFFF"/>
+                <w:sz w:val="17"/>
+              </w:rPr>
+              <w:t>처리 원칙</w:t>
+            </w:r>
+          </w:p>
+        </w:tc>
+      </w:tr>
+      <w:tr>
+        <w:trPr>
+          <w:cantSplit/>
+        </w:trPr>
+        <w:tc>
+          <w:tcPr>
+            <w:tcW w:type="dxa" w:w="1154"/>
+            <w:tcMar>
+              <w:top w:w="100" w:type="dxa"/>
+              <w:start w:w="130" w:type="dxa"/>
+              <w:bottom w:w="100" w:type="dxa"/>
+              <w:end w:w="130" w:type="dxa"/>
+            </w:tcMar>
+            <w:vAlign w:val="center"/>
+          </w:tcPr>
+          <w:p>
+            <w:pPr>
+              <w:spacing w:after="0" w:line="264" w:lineRule="auto"/>
+            </w:pPr>
+            <w:r>
+              <w:rPr>
+                <w:rFonts w:ascii="Malgun Gothic" w:hAnsi="Malgun Gothic" w:eastAsia="Malgun Gothic"/>
+                <w:b w:val="0"/>
+                <w:color w:val="152238"/>
+                <w:sz w:val="17"/>
+              </w:rPr>
+              <w:t>신청기한</w:t>
+            </w:r>
+          </w:p>
+        </w:tc>
+        <w:tc>
+          <w:tcPr>
+            <w:tcW w:type="dxa" w:w="3923"/>
+            <w:tcMar>
+              <w:top w:w="100" w:type="dxa"/>
+              <w:start w:w="130" w:type="dxa"/>
+              <w:bottom w:w="100" w:type="dxa"/>
+              <w:end w:w="130" w:type="dxa"/>
+            </w:tcMar>
+            <w:vAlign w:val="center"/>
+          </w:tcPr>
+          <w:p>
+            <w:pPr>
+              <w:spacing w:after="0" w:line="264" w:lineRule="auto"/>
+            </w:pPr>
+            <w:r>
+              <w:rPr>
+                <w:rFonts w:ascii="Malgun Gothic" w:hAnsi="Malgun Gothic" w:eastAsia="Malgun Gothic"/>
+                <w:b w:val="0"/>
+                <w:color w:val="152238"/>
+                <w:sz w:val="17"/>
+              </w:rPr>
+              <w:t>30일 이내 정상, 31~60일 지연, 61~180일 장기 지연, 180일 초과 원칙적 거절</w:t>
+            </w:r>
+          </w:p>
+        </w:tc>
+        <w:tc>
+          <w:tcPr>
+            <w:tcW w:type="dxa" w:w="3923"/>
+            <w:tcMar>
+              <w:top w:w="100" w:type="dxa"/>
+              <w:start w:w="130" w:type="dxa"/>
+              <w:bottom w:w="100" w:type="dxa"/>
+              <w:end w:w="130" w:type="dxa"/>
+            </w:tcMar>
+            <w:vAlign w:val="center"/>
+          </w:tcPr>
+          <w:p>
+            <w:pPr>
+              <w:spacing w:after="0" w:line="264" w:lineRule="auto"/>
+            </w:pPr>
+            <w:r>
+              <w:rPr>
+                <w:rFonts w:ascii="Malgun Gothic" w:hAnsi="Malgun Gothic" w:eastAsia="Malgun Gothic"/>
+                <w:b w:val="0"/>
+                <w:color w:val="152238"/>
+                <w:sz w:val="17"/>
+              </w:rPr>
+              <w:t>객관적 증빙과 불가피한 사유가 있으면 예외심사하며, 회계연도 경과 건은 일반 접수를 막고 별도 회계검토로 보낸다.</w:t>
+            </w:r>
+          </w:p>
+        </w:tc>
+      </w:tr>
+      <w:tr>
+        <w:trPr>
+          <w:cantSplit/>
+        </w:trPr>
+        <w:tc>
+          <w:tcPr>
+            <w:tcW w:type="dxa" w:w="1154"/>
+            <w:tcMar>
+              <w:top w:w="100" w:type="dxa"/>
+              <w:start w:w="130" w:type="dxa"/>
+              <w:bottom w:w="100" w:type="dxa"/>
+              <w:end w:w="130" w:type="dxa"/>
+            </w:tcMar>
+            <w:vAlign w:val="center"/>
+            <w:shd w:fill="F4F6F9"/>
+          </w:tcPr>
+          <w:p>
+            <w:pPr>
+              <w:spacing w:after="0" w:line="264" w:lineRule="auto"/>
+            </w:pPr>
+            <w:r>
+              <w:rPr>
+                <w:rFonts w:ascii="Malgun Gothic" w:hAnsi="Malgun Gothic" w:eastAsia="Malgun Gothic"/>
+                <w:b w:val="0"/>
+                <w:color w:val="152238"/>
+                <w:sz w:val="17"/>
+              </w:rPr>
+              <w:t>금액별 승인</w:t>
+            </w:r>
+          </w:p>
+        </w:tc>
+        <w:tc>
+          <w:tcPr>
+            <w:tcW w:type="dxa" w:w="3923"/>
+            <w:tcMar>
+              <w:top w:w="100" w:type="dxa"/>
+              <w:start w:w="130" w:type="dxa"/>
+              <w:bottom w:w="100" w:type="dxa"/>
+              <w:end w:w="130" w:type="dxa"/>
+            </w:tcMar>
+            <w:vAlign w:val="center"/>
+            <w:shd w:fill="F4F6F9"/>
+          </w:tcPr>
+          <w:p>
+            <w:pPr>
+              <w:spacing w:after="0" w:line="264" w:lineRule="auto"/>
+            </w:pPr>
+            <w:r>
+              <w:rPr>
+                <w:rFonts w:ascii="Malgun Gothic" w:hAnsi="Malgun Gothic" w:eastAsia="Malgun Gothic"/>
+                <w:b w:val="0"/>
+                <w:color w:val="152238"/>
+                <w:sz w:val="17"/>
+              </w:rPr>
+              <w:t>예산 내 50만원 이하 간소 승인, 50만원 초과~300만원 일반 승인, 300만원 초과 상위·복수 승인</w:t>
+            </w:r>
+          </w:p>
+        </w:tc>
+        <w:tc>
+          <w:tcPr>
+            <w:tcW w:type="dxa" w:w="3923"/>
+            <w:tcMar>
+              <w:top w:w="100" w:type="dxa"/>
+              <w:start w:w="130" w:type="dxa"/>
+              <w:bottom w:w="100" w:type="dxa"/>
+              <w:end w:w="130" w:type="dxa"/>
+            </w:tcMar>
+            <w:vAlign w:val="center"/>
+            <w:shd w:fill="F4F6F9"/>
+          </w:tcPr>
+          <w:p>
+            <w:pPr>
+              <w:spacing w:after="0" w:line="264" w:lineRule="auto"/>
+            </w:pPr>
+            <w:r>
+              <w:rPr>
+                <w:rFonts w:ascii="Malgun Gothic" w:hAnsi="Malgun Gothic" w:eastAsia="Malgun Gothic"/>
+                <w:b w:val="0"/>
+                <w:color w:val="152238"/>
+                <w:sz w:val="17"/>
+              </w:rPr>
+              <w:t>예산 외 지출, 신탁 사업비, 특수관계인 거래는 금액과 관계없이 별도 승인한다. 금액을 나누어 한도를 피하지 않는다.</w:t>
+            </w:r>
+          </w:p>
+        </w:tc>
+      </w:tr>
+      <w:tr>
+        <w:trPr>
+          <w:cantSplit/>
+        </w:trPr>
+        <w:tc>
+          <w:tcPr>
+            <w:tcW w:type="dxa" w:w="1154"/>
+            <w:tcMar>
+              <w:top w:w="100" w:type="dxa"/>
+              <w:start w:w="130" w:type="dxa"/>
+              <w:bottom w:w="100" w:type="dxa"/>
+              <w:end w:w="130" w:type="dxa"/>
+            </w:tcMar>
+            <w:vAlign w:val="center"/>
+          </w:tcPr>
+          <w:p>
+            <w:pPr>
+              <w:spacing w:after="0" w:line="264" w:lineRule="auto"/>
+            </w:pPr>
+            <w:r>
+              <w:rPr>
+                <w:rFonts w:ascii="Malgun Gothic" w:hAnsi="Malgun Gothic" w:eastAsia="Malgun Gothic"/>
+                <w:b w:val="0"/>
+                <w:color w:val="152238"/>
+                <w:sz w:val="17"/>
+              </w:rPr>
+              <w:t>회계 중요성</w:t>
+            </w:r>
+          </w:p>
+        </w:tc>
+        <w:tc>
+          <w:tcPr>
+            <w:tcW w:type="dxa" w:w="3923"/>
+            <w:tcMar>
+              <w:top w:w="100" w:type="dxa"/>
+              <w:start w:w="130" w:type="dxa"/>
+              <w:bottom w:w="100" w:type="dxa"/>
+              <w:end w:w="130" w:type="dxa"/>
+            </w:tcMar>
+            <w:vAlign w:val="center"/>
+          </w:tcPr>
+          <w:p>
+            <w:pPr>
+              <w:spacing w:after="0" w:line="264" w:lineRule="auto"/>
+            </w:pPr>
+            <w:r>
+              <w:rPr>
+                <w:rFonts w:ascii="Malgun Gothic" w:hAnsi="Malgun Gothic" w:eastAsia="Malgun Gothic"/>
+                <w:b w:val="0"/>
+                <w:color w:val="152238"/>
+                <w:sz w:val="17"/>
+              </w:rPr>
+              <w:t>100만원 이상 또는 해당 월 예산의 1% 이상이면 중요성 검토</w:t>
+            </w:r>
+          </w:p>
+        </w:tc>
+        <w:tc>
+          <w:tcPr>
+            <w:tcW w:type="dxa" w:w="3923"/>
+            <w:tcMar>
+              <w:top w:w="100" w:type="dxa"/>
+              <w:start w:w="130" w:type="dxa"/>
+              <w:bottom w:w="100" w:type="dxa"/>
+              <w:end w:w="130" w:type="dxa"/>
+            </w:tcMar>
+            <w:vAlign w:val="center"/>
+          </w:tcPr>
+          <w:p>
+            <w:pPr>
+              <w:spacing w:after="0" w:line="264" w:lineRule="auto"/>
+            </w:pPr>
+            <w:r>
+              <w:rPr>
+                <w:rFonts w:ascii="Malgun Gothic" w:hAnsi="Malgun Gothic" w:eastAsia="Malgun Gothic"/>
+                <w:b w:val="0"/>
+                <w:color w:val="152238"/>
+                <w:sz w:val="17"/>
+              </w:rPr>
+              <w:t>아래 정성 기준 중 하나라도 해당하면 금액과 관계없이 중요성 검토를 한다.</w:t>
+            </w:r>
+          </w:p>
+        </w:tc>
+      </w:tr>
+      <w:tr>
+        <w:trPr>
+          <w:cantSplit/>
+        </w:trPr>
+        <w:tc>
+          <w:tcPr>
+            <w:tcW w:type="dxa" w:w="1154"/>
+            <w:tcMar>
+              <w:top w:w="100" w:type="dxa"/>
+              <w:start w:w="130" w:type="dxa"/>
+              <w:bottom w:w="100" w:type="dxa"/>
+              <w:end w:w="130" w:type="dxa"/>
+            </w:tcMar>
+            <w:vAlign w:val="center"/>
+            <w:shd w:fill="F4F6F9"/>
+          </w:tcPr>
+          <w:p>
+            <w:pPr>
+              <w:spacing w:after="0" w:line="264" w:lineRule="auto"/>
+            </w:pPr>
+            <w:r>
+              <w:rPr>
+                <w:rFonts w:ascii="Malgun Gothic" w:hAnsi="Malgun Gothic" w:eastAsia="Malgun Gothic"/>
+                <w:b w:val="0"/>
+                <w:color w:val="152238"/>
+                <w:sz w:val="17"/>
+              </w:rPr>
+              <w:t>과거연도 처리</w:t>
+            </w:r>
+          </w:p>
+        </w:tc>
+        <w:tc>
+          <w:tcPr>
+            <w:tcW w:type="dxa" w:w="3923"/>
+            <w:tcMar>
+              <w:top w:w="100" w:type="dxa"/>
+              <w:start w:w="130" w:type="dxa"/>
+              <w:bottom w:w="100" w:type="dxa"/>
+              <w:end w:w="130" w:type="dxa"/>
+            </w:tcMar>
+            <w:vAlign w:val="center"/>
+            <w:shd w:fill="F4F6F9"/>
+          </w:tcPr>
+          <w:p>
+            <w:pPr>
+              <w:spacing w:after="0" w:line="264" w:lineRule="auto"/>
+            </w:pPr>
+            <w:r>
+              <w:rPr>
+                <w:rFonts w:ascii="Malgun Gothic" w:hAnsi="Malgun Gothic" w:eastAsia="Malgun Gothic"/>
+                <w:b w:val="0"/>
+                <w:color w:val="152238"/>
+                <w:sz w:val="17"/>
+              </w:rPr>
+              <w:t>일반 접수 차단 후 별도 회계검토</w:t>
+            </w:r>
+          </w:p>
+        </w:tc>
+        <w:tc>
+          <w:tcPr>
+            <w:tcW w:type="dxa" w:w="3923"/>
+            <w:tcMar>
+              <w:top w:w="100" w:type="dxa"/>
+              <w:start w:w="130" w:type="dxa"/>
+              <w:bottom w:w="100" w:type="dxa"/>
+              <w:end w:w="130" w:type="dxa"/>
+            </w:tcMar>
+            <w:vAlign w:val="center"/>
+            <w:shd w:fill="F4F6F9"/>
+          </w:tcPr>
+          <w:p>
+            <w:pPr>
+              <w:spacing w:after="0" w:line="264" w:lineRule="auto"/>
+            </w:pPr>
+            <w:r>
+              <w:rPr>
+                <w:rFonts w:ascii="Malgun Gothic" w:hAnsi="Malgun Gothic" w:eastAsia="Malgun Gothic"/>
+                <w:b w:val="0"/>
+                <w:color w:val="152238"/>
+                <w:sz w:val="17"/>
+              </w:rPr>
+              <w:t>`회계 확인 → 상위 예외승인 → 외부 회계전문가 검토 → 필요한 경우 이사회·총회 보고 또는 의결 → 지급` 순서로 처리한다.</w:t>
+            </w:r>
+          </w:p>
+        </w:tc>
+      </w:tr>
+    </w:tbl>
+    <w:p>
+      <w:pPr>
+        <w:spacing w:after="40"/>
+      </w:pPr>
+    </w:p>
+    <w:p>
+      <w:r>
+        <w:rPr>
+          <w:rFonts w:ascii="Malgun Gothic" w:hAnsi="Malgun Gothic" w:eastAsia="Malgun Gothic"/>
+          <w:b w:val="0"/>
+          <w:color w:val="152238"/>
+          <w:sz w:val="21"/>
+        </w:rPr>
+        <w:t>금액 기준은 모든 지출의 지급을 자동 허용하는 기준이 아니다. 계약·법령·정관·총회 또는 이사회 의결에서 더 엄격한 한도를 정했다면 그 기준을 우선한다.</w:t>
+      </w:r>
+    </w:p>
+    <w:p>
+      <w:pPr>
+        <w:pStyle w:val="Heading3"/>
+      </w:pPr>
+      <w:r>
+        <w:t>중요성 검토 조건</w:t>
+      </w:r>
+    </w:p>
+    <w:p>
+      <w:r>
+        <w:rPr>
+          <w:rFonts w:ascii="Malgun Gothic" w:hAnsi="Malgun Gothic" w:eastAsia="Malgun Gothic"/>
+          <w:b w:val="0"/>
+          <w:color w:val="152238"/>
+          <w:sz w:val="21"/>
+        </w:rPr>
+        <w:t xml:space="preserve">다음 중 하나라도 해당하면 금액기준 미만이어도 </w:t>
+      </w:r>
+      <w:r>
+        <w:rPr>
+          <w:rFonts w:ascii="Malgun Gothic" w:hAnsi="Malgun Gothic" w:eastAsia="Malgun Gothic"/>
+          <w:b/>
+          <w:color w:val="2457C5"/>
+          <w:sz w:val="19"/>
+        </w:rPr>
+        <w:t>중요성 검토 필요</w:t>
+      </w:r>
+      <w:r>
+        <w:rPr>
+          <w:rFonts w:ascii="Malgun Gothic" w:hAnsi="Malgun Gothic" w:eastAsia="Malgun Gothic"/>
+          <w:b w:val="0"/>
+          <w:color w:val="152238"/>
+          <w:sz w:val="21"/>
+        </w:rPr>
+        <w:t>로 표시한다.</w:t>
       </w:r>
     </w:p>
     <w:p>
@@ -10802,7 +11301,7 @@
           <w:color w:val="152238"/>
           <w:sz w:val="21"/>
         </w:rPr>
-        <w:t>기능을 추가하거나 메뉴명이 바뀌면 관련 Markdown 파일만 수정하고 CHANGELOG.md에 변경 내용을 기록합니다.</w:t>
+        <w:t>해당 월 예산을 초과하거나 예산항목의 변경·전용이 필요한 경우</w:t>
       </w:r>
     </w:p>
     <w:p>
@@ -10820,7 +11319,7 @@
           <w:color w:val="152238"/>
           <w:sz w:val="21"/>
         </w:rPr>
-        <w:t>사이드바 전체 이미지는 공통 문서에 한 번만 사용하고, 각 튜토리얼에서는 ‘기안·결재 → 새 기안’처럼 텍스트 경로를 사용합니다.</w:t>
+        <w:t>신탁 사업비 또는 특수관계인과의 거래인 경우</w:t>
       </w:r>
     </w:p>
     <w:p>
@@ -10838,7 +11337,7 @@
           <w:color w:val="152238"/>
           <w:sz w:val="21"/>
         </w:rPr>
-        <w:t>정식 배포 전에는 운영 화면에서 모든 경로와 버튼명을 다시 확인하고, 개인정보를 가린 최종 스크린샷으로 교체합니다.</w:t>
+        <w:t>중복, 허위, 분할등록, 승인 우회 등 부정 가능성이 있는 경우</w:t>
       </w:r>
     </w:p>
     <w:p>
@@ -10856,15 +11355,53 @@
           <w:color w:val="152238"/>
           <w:sz w:val="21"/>
         </w:rPr>
-        <w:t>Word 설명서는 이 폴더의 build_manual.py를 실행해 다시 생성한 뒤 전 페이지 렌더링 검수를 진행합니다.</w:t>
-      </w:r>
-    </w:p>
-    <w:p>
-      <w:pPr>
-        <w:pStyle w:val="Heading2"/>
-      </w:pPr>
-      <w:r>
-        <w:t>이미지 촬영 체크리스트</w:t>
+        <w:t>이미 배포한 월·연간 회계보고의 수치나 결론을 바꾸는 경우</w:t>
+      </w:r>
+    </w:p>
+    <w:p>
+      <w:pPr>
+        <w:spacing w:after="80" w:line="283" w:lineRule="auto"/>
+        <w:numPr>
+          <w:ilvl w:val="0"/>
+          <w:numId w:val="56"/>
+        </w:numPr>
+      </w:pPr>
+      <w:r>
+        <w:rPr>
+          <w:rFonts w:ascii="Malgun Gothic" w:hAnsi="Malgun Gothic" w:eastAsia="Malgun Gothic"/>
+          <w:b w:val="0"/>
+          <w:color w:val="152238"/>
+          <w:sz w:val="21"/>
+        </w:rPr>
+        <w:t>외부감사, 세무신고 또는 조합원 보고에 영향을 줄 수 있는 경우</w:t>
+      </w:r>
+    </w:p>
+    <w:p>
+      <w:pPr>
+        <w:pStyle w:val="Heading3"/>
+      </w:pPr>
+      <w:r>
+        <w:t>설정 화면 구성</w:t>
+      </w:r>
+    </w:p>
+    <w:p>
+      <w:r>
+        <w:rPr>
+          <w:rFonts w:ascii="Malgun Gothic" w:hAnsi="Malgun Gothic" w:eastAsia="Malgun Gothic"/>
+          <w:b/>
+          <w:color w:val="2457C5"/>
+          <w:sz w:val="19"/>
+        </w:rPr>
+        <w:t>회계/자금 → 지출·신탁 설정 → 운영 기준</w:t>
+      </w:r>
+      <w:r>
+        <w:rPr>
+          <w:rFonts w:ascii="Malgun Gothic" w:hAnsi="Malgun Gothic" w:eastAsia="Malgun Gothic"/>
+          <w:b w:val="0"/>
+          <w:color w:val="152238"/>
+          <w:sz w:val="21"/>
+        </w:rPr>
+        <w:t>에서 다음 탭을 제공한다.</w:t>
       </w:r>
     </w:p>
     <w:p>
@@ -10878,11 +11415,20 @@
       <w:r>
         <w:rPr>
           <w:rFonts w:ascii="Malgun Gothic" w:hAnsi="Malgun Gothic" w:eastAsia="Malgun Gothic"/>
-          <w:b w:val="0"/>
-          <w:color w:val="152238"/>
-          <w:sz w:val="21"/>
-        </w:rPr>
-        <w:t>실제 조합원 이름, 주민번호, 연락처와 계좌번호를 가렸는가?</w:t>
+          <w:b/>
+          <w:color w:val="2457C5"/>
+          <w:sz w:val="19"/>
+        </w:rPr>
+        <w:t>처리기한</w:t>
+      </w:r>
+      <w:r>
+        <w:rPr>
+          <w:rFonts w:ascii="Malgun Gothic" w:hAnsi="Malgun Gothic" w:eastAsia="Malgun Gothic"/>
+          <w:b w:val="0"/>
+          <w:color w:val="152238"/>
+          <w:sz w:val="21"/>
+        </w:rPr>
+        <w:t>: 정상·지연·장기 지연·원칙적 거절의 경계일과 예외 허용 여부</w:t>
       </w:r>
     </w:p>
     <w:p>
@@ -10896,11 +11442,20 @@
       <w:r>
         <w:rPr>
           <w:rFonts w:ascii="Malgun Gothic" w:hAnsi="Malgun Gothic" w:eastAsia="Malgun Gothic"/>
-          <w:b w:val="0"/>
-          <w:color w:val="152238"/>
-          <w:sz w:val="21"/>
-        </w:rPr>
-        <w:t>화면의 클릭 위치와 설명의 단계 번호가 일치하는가?</w:t>
+          <w:b/>
+          <w:color w:val="2457C5"/>
+          <w:sz w:val="19"/>
+        </w:rPr>
+        <w:t>금액별 승인</w:t>
+      </w:r>
+      <w:r>
+        <w:rPr>
+          <w:rFonts w:ascii="Malgun Gothic" w:hAnsi="Malgun Gothic" w:eastAsia="Malgun Gothic"/>
+          <w:b w:val="0"/>
+          <w:color w:val="152238"/>
+          <w:sz w:val="21"/>
+        </w:rPr>
+        <w:t>: 금액 구간, 예산 내·외, 필요한 승인 단계와 승인자 역할</w:t>
       </w:r>
     </w:p>
     <w:p>
@@ -10914,11 +11469,20 @@
       <w:r>
         <w:rPr>
           <w:rFonts w:ascii="Malgun Gothic" w:hAnsi="Malgun Gothic" w:eastAsia="Malgun Gothic"/>
-          <w:b w:val="0"/>
-          <w:color w:val="152238"/>
-          <w:sz w:val="21"/>
-        </w:rPr>
-        <w:t>현재 운영 버전의 메뉴명과 선택 상태가 정확한가?</w:t>
+          <w:b/>
+          <w:color w:val="2457C5"/>
+          <w:sz w:val="19"/>
+        </w:rPr>
+        <w:t>회계 중요성</w:t>
+      </w:r>
+      <w:r>
+        <w:rPr>
+          <w:rFonts w:ascii="Malgun Gothic" w:hAnsi="Malgun Gothic" w:eastAsia="Malgun Gothic"/>
+          <w:b w:val="0"/>
+          <w:color w:val="152238"/>
+          <w:sz w:val="21"/>
+        </w:rPr>
+        <w:t>: 금액, 월 예산 비율과 정성 조건</w:t>
       </w:r>
     </w:p>
     <w:p>
@@ -10932,11 +11496,20 @@
       <w:r>
         <w:rPr>
           <w:rFonts w:ascii="Malgun Gothic" w:hAnsi="Malgun Gothic" w:eastAsia="Malgun Gothic"/>
-          <w:b w:val="0"/>
-          <w:color w:val="152238"/>
-          <w:sz w:val="21"/>
-        </w:rPr>
-        <w:t>같은 사이드바 이미지를 여러 장에서 중복 사용하지 않았는가?</w:t>
+          <w:b/>
+          <w:color w:val="2457C5"/>
+          <w:sz w:val="19"/>
+        </w:rPr>
+        <w:t>과거연도 처리</w:t>
+      </w:r>
+      <w:r>
+        <w:rPr>
+          <w:rFonts w:ascii="Malgun Gothic" w:hAnsi="Malgun Gothic" w:eastAsia="Malgun Gothic"/>
+          <w:b w:val="0"/>
+          <w:color w:val="152238"/>
+          <w:sz w:val="21"/>
+        </w:rPr>
+        <w:t>: 접수 제한, 예외 승인경로, 전문가 검토와 보고 기준</w:t>
       </w:r>
     </w:p>
     <w:p>
@@ -10945,6 +11518,388 @@
         <w:numPr>
           <w:ilvl w:val="0"/>
           <w:numId w:val="57"/>
+        </w:numPr>
+      </w:pPr>
+      <w:r>
+        <w:rPr>
+          <w:rFonts w:ascii="Malgun Gothic" w:hAnsi="Malgun Gothic" w:eastAsia="Malgun Gothic"/>
+          <w:b/>
+          <w:color w:val="2457C5"/>
+          <w:sz w:val="19"/>
+        </w:rPr>
+        <w:t>정책 변경이력</w:t>
+      </w:r>
+      <w:r>
+        <w:rPr>
+          <w:rFonts w:ascii="Malgun Gothic" w:hAnsi="Malgun Gothic" w:eastAsia="Malgun Gothic"/>
+          <w:b w:val="0"/>
+          <w:color w:val="152238"/>
+          <w:sz w:val="21"/>
+        </w:rPr>
+        <w:t>: 버전, 변경 전·후 값, 사유, 작성자·승인자와 시행기간</w:t>
+      </w:r>
+    </w:p>
+    <w:p>
+      <w:r>
+        <w:rPr>
+          <w:rFonts w:ascii="Malgun Gothic" w:hAnsi="Malgun Gothic" w:eastAsia="Malgun Gothic"/>
+          <w:b w:val="0"/>
+          <w:color w:val="152238"/>
+          <w:sz w:val="21"/>
+        </w:rPr>
+        <w:t xml:space="preserve">각 설정에는 현재값, </w:t>
+      </w:r>
+      <w:r>
+        <w:rPr>
+          <w:rFonts w:ascii="Malgun Gothic" w:hAnsi="Malgun Gothic" w:eastAsia="Malgun Gothic"/>
+          <w:b/>
+          <w:color w:val="2457C5"/>
+          <w:sz w:val="19"/>
+        </w:rPr>
+        <w:t>추천값 불러오기</w:t>
+      </w:r>
+      <w:r>
+        <w:rPr>
+          <w:rFonts w:ascii="Malgun Gothic" w:hAnsi="Malgun Gothic" w:eastAsia="Malgun Gothic"/>
+          <w:b w:val="0"/>
+          <w:color w:val="152238"/>
+          <w:sz w:val="21"/>
+        </w:rPr>
+        <w:t xml:space="preserve">, 변경값, 시행일, 변경 사유, 승인자와 상태를 표시한다. 상태는 </w:t>
+      </w:r>
+      <w:r>
+        <w:rPr>
+          <w:rFonts w:ascii="Malgun Gothic" w:hAnsi="Malgun Gothic" w:eastAsia="Malgun Gothic"/>
+          <w:b/>
+          <w:color w:val="2457C5"/>
+          <w:sz w:val="19"/>
+        </w:rPr>
+        <w:t>초안 → 승인대기 → 활성 → 종료</w:t>
+      </w:r>
+      <w:r>
+        <w:rPr>
+          <w:rFonts w:ascii="Malgun Gothic" w:hAnsi="Malgun Gothic" w:eastAsia="Malgun Gothic"/>
+          <w:b w:val="0"/>
+          <w:color w:val="152238"/>
+          <w:sz w:val="21"/>
+        </w:rPr>
+        <w:t xml:space="preserve"> 순서로 관리하고, 가능하면 설정 작성자와 활성 승인자를 분리한다.</w:t>
+      </w:r>
+    </w:p>
+    <w:p>
+      <w:pPr>
+        <w:pStyle w:val="Heading3"/>
+      </w:pPr>
+      <w:r>
+        <w:t>변경·활성화 절차</w:t>
+      </w:r>
+    </w:p>
+    <w:p>
+      <w:pPr>
+        <w:spacing w:after="80" w:line="283" w:lineRule="auto"/>
+        <w:numPr>
+          <w:ilvl w:val="0"/>
+          <w:numId w:val="58"/>
+        </w:numPr>
+      </w:pPr>
+      <w:r>
+        <w:rPr>
+          <w:rFonts w:ascii="Malgun Gothic" w:hAnsi="Malgun Gothic" w:eastAsia="Malgun Gothic"/>
+          <w:b w:val="0"/>
+          <w:color w:val="152238"/>
+          <w:sz w:val="21"/>
+        </w:rPr>
+        <w:t>관리자가 추천값을 불러오거나 현재값을 복사해 초안을 만든다.</w:t>
+      </w:r>
+    </w:p>
+    <w:p>
+      <w:pPr>
+        <w:spacing w:after="80" w:line="283" w:lineRule="auto"/>
+        <w:numPr>
+          <w:ilvl w:val="0"/>
+          <w:numId w:val="58"/>
+        </w:numPr>
+      </w:pPr>
+      <w:r>
+        <w:rPr>
+          <w:rFonts w:ascii="Malgun Gothic" w:hAnsi="Malgun Gothic" w:eastAsia="Malgun Gothic"/>
+          <w:b w:val="0"/>
+          <w:color w:val="152238"/>
+          <w:sz w:val="21"/>
+        </w:rPr>
+        <w:t>조합의 의결사항과 계약조건에 맞게 값을 수정하고 변경 사유와 시행일을 입력한다.</w:t>
+      </w:r>
+    </w:p>
+    <w:p>
+      <w:pPr>
+        <w:spacing w:after="80" w:line="283" w:lineRule="auto"/>
+        <w:numPr>
+          <w:ilvl w:val="0"/>
+          <w:numId w:val="58"/>
+        </w:numPr>
+      </w:pPr>
+      <w:r>
+        <w:rPr>
+          <w:rFonts w:ascii="Malgun Gothic" w:hAnsi="Malgun Gothic" w:eastAsia="Malgun Gothic"/>
+          <w:b/>
+          <w:color w:val="2457C5"/>
+          <w:sz w:val="19"/>
+        </w:rPr>
+        <w:t>영향 미리보기</w:t>
+      </w:r>
+      <w:r>
+        <w:rPr>
+          <w:rFonts w:ascii="Malgun Gothic" w:hAnsi="Malgun Gothic" w:eastAsia="Malgun Gothic"/>
+          <w:b w:val="0"/>
+          <w:color w:val="152238"/>
+          <w:sz w:val="21"/>
+        </w:rPr>
+        <w:t>에서 새 기준에 해당하는 미처리 신청 건수와 상태 변화 예상치를 확인한다.</w:t>
+      </w:r>
+    </w:p>
+    <w:p>
+      <w:pPr>
+        <w:spacing w:after="80" w:line="283" w:lineRule="auto"/>
+        <w:numPr>
+          <w:ilvl w:val="0"/>
+          <w:numId w:val="58"/>
+        </w:numPr>
+      </w:pPr>
+      <w:r>
+        <w:rPr>
+          <w:rFonts w:ascii="Malgun Gothic" w:hAnsi="Malgun Gothic" w:eastAsia="Malgun Gothic"/>
+          <w:b w:val="0"/>
+          <w:color w:val="152238"/>
+          <w:sz w:val="21"/>
+        </w:rPr>
+        <w:t>다른 승인자가 변경 전·후 값을 비교해 승인한다.</w:t>
+      </w:r>
+    </w:p>
+    <w:p>
+      <w:pPr>
+        <w:spacing w:after="80" w:line="283" w:lineRule="auto"/>
+        <w:numPr>
+          <w:ilvl w:val="0"/>
+          <w:numId w:val="58"/>
+        </w:numPr>
+      </w:pPr>
+      <w:r>
+        <w:rPr>
+          <w:rFonts w:ascii="Malgun Gothic" w:hAnsi="Malgun Gothic" w:eastAsia="Malgun Gothic"/>
+          <w:b w:val="0"/>
+          <w:color w:val="152238"/>
+          <w:sz w:val="21"/>
+        </w:rPr>
+        <w:t>시행일이 되면 새 신청부터 새 정책 버전을 적용한다.</w:t>
+      </w:r>
+    </w:p>
+    <w:p>
+      <w:r>
+        <w:rPr>
+          <w:rFonts w:ascii="Malgun Gothic" w:hAnsi="Malgun Gothic" w:eastAsia="Malgun Gothic"/>
+          <w:b w:val="0"/>
+          <w:color w:val="152238"/>
+          <w:sz w:val="21"/>
+        </w:rPr>
+        <w:t>신청을 제출할 때 적용한 정책 버전을 신청 기록에 고정한다. 정책을 바꿔도 기존 신청, 지급완료 건과 마감월을 조용히 소급 변경하지 않는다. 진행 중인 신청에 새 정책을 적용하려면 영향대상과 변경 결과를 먼저 보여주고 별도 승인을 받아야 한다. 변경한 정책은 삭제하지 않고 종료 처리하여 유효기간과 감사 이력을 보존한다.</w:t>
+      </w:r>
+    </w:p>
+    <w:p>
+      <w:pPr>
+        <w:pStyle w:val="Heading2"/>
+      </w:pPr>
+      <w:r>
+        <w:t>18. 규정 시행과 변경</w:t>
+      </w:r>
+    </w:p>
+    <w:p>
+      <w:r>
+        <w:rPr>
+          <w:rFonts w:ascii="Malgun Gothic" w:hAnsi="Malgun Gothic" w:eastAsia="Malgun Gothic"/>
+          <w:b w:val="0"/>
+          <w:color w:val="152238"/>
+          <w:sz w:val="21"/>
+        </w:rPr>
+        <w:t>새 규정은 시행일과 경과조치를 함께 의결한다. 시행 전에 발생한 미정산 건에는 일정한 정리기간을 부여하고 그 이후부터 새 기한을 적용한다. 승인한도, 제출기한, 역할과 예외 기준을 바꾸면 변경일, 의결 근거와 적용 대상을 기록하고 이미 마감한 월에 임의로 소급하지 않는다.</w:t>
+      </w:r>
+    </w:p>
+    <w:p>
+      <w:r>
+        <w:rPr>
+          <w:rFonts w:ascii="Malgun Gothic" w:hAnsi="Malgun Gothic" w:eastAsia="Malgun Gothic"/>
+          <w:b w:val="0"/>
+          <w:color w:val="152238"/>
+          <w:sz w:val="21"/>
+        </w:rPr>
+        <w:t>주택조합은 거래 장부를 월별로 작성하고 증빙서류와 함께 보관해야 한다. ERP의 원본·변경·승인·지급·마감 이력은 이 의무를 지원하기 위한 기록이며, 원본 삭제나 이력 없는 수정을 허용하지 않는다.</w:t>
+      </w:r>
+    </w:p>
+    <w:p>
+      <w:pPr>
+        <w:pStyle w:val="Heading1"/>
+      </w:pPr>
+      <w:r>
+        <w:t>부록. 설명서 업데이트 방법</w:t>
+      </w:r>
+    </w:p>
+    <w:p>
+      <w:pPr>
+        <w:spacing w:after="80" w:line="283" w:lineRule="auto"/>
+        <w:numPr>
+          <w:ilvl w:val="0"/>
+          <w:numId w:val="59"/>
+        </w:numPr>
+      </w:pPr>
+      <w:r>
+        <w:rPr>
+          <w:rFonts w:ascii="Malgun Gothic" w:hAnsi="Malgun Gothic" w:eastAsia="Malgun Gothic"/>
+          <w:b w:val="0"/>
+          <w:color w:val="152238"/>
+          <w:sz w:val="21"/>
+        </w:rPr>
+        <w:t>기능을 추가하거나 메뉴명이 바뀌면 관련 Markdown 파일만 수정하고 CHANGELOG.md에 변경 내용을 기록합니다.</w:t>
+      </w:r>
+    </w:p>
+    <w:p>
+      <w:pPr>
+        <w:spacing w:after="80" w:line="283" w:lineRule="auto"/>
+        <w:numPr>
+          <w:ilvl w:val="0"/>
+          <w:numId w:val="59"/>
+        </w:numPr>
+      </w:pPr>
+      <w:r>
+        <w:rPr>
+          <w:rFonts w:ascii="Malgun Gothic" w:hAnsi="Malgun Gothic" w:eastAsia="Malgun Gothic"/>
+          <w:b w:val="0"/>
+          <w:color w:val="152238"/>
+          <w:sz w:val="21"/>
+        </w:rPr>
+        <w:t>사이드바 전체 이미지는 공통 문서에 한 번만 사용하고, 각 튜토리얼에서는 ‘기안·결재 → 새 기안’처럼 텍스트 경로를 사용합니다.</w:t>
+      </w:r>
+    </w:p>
+    <w:p>
+      <w:pPr>
+        <w:spacing w:after="80" w:line="283" w:lineRule="auto"/>
+        <w:numPr>
+          <w:ilvl w:val="0"/>
+          <w:numId w:val="59"/>
+        </w:numPr>
+      </w:pPr>
+      <w:r>
+        <w:rPr>
+          <w:rFonts w:ascii="Malgun Gothic" w:hAnsi="Malgun Gothic" w:eastAsia="Malgun Gothic"/>
+          <w:b w:val="0"/>
+          <w:color w:val="152238"/>
+          <w:sz w:val="21"/>
+        </w:rPr>
+        <w:t>정식 배포 전에는 운영 화면에서 모든 경로와 버튼명을 다시 확인하고, 개인정보를 가린 최종 스크린샷으로 교체합니다.</w:t>
+      </w:r>
+    </w:p>
+    <w:p>
+      <w:pPr>
+        <w:spacing w:after="80" w:line="283" w:lineRule="auto"/>
+        <w:numPr>
+          <w:ilvl w:val="0"/>
+          <w:numId w:val="59"/>
+        </w:numPr>
+      </w:pPr>
+      <w:r>
+        <w:rPr>
+          <w:rFonts w:ascii="Malgun Gothic" w:hAnsi="Malgun Gothic" w:eastAsia="Malgun Gothic"/>
+          <w:b w:val="0"/>
+          <w:color w:val="152238"/>
+          <w:sz w:val="21"/>
+        </w:rPr>
+        <w:t>Word 설명서는 이 폴더의 build_manual.py를 실행해 다시 생성한 뒤 전 페이지 렌더링 검수를 진행합니다.</w:t>
+      </w:r>
+    </w:p>
+    <w:p>
+      <w:pPr>
+        <w:pStyle w:val="Heading2"/>
+      </w:pPr>
+      <w:r>
+        <w:t>이미지 촬영 체크리스트</w:t>
+      </w:r>
+    </w:p>
+    <w:p>
+      <w:pPr>
+        <w:spacing w:after="80" w:line="283" w:lineRule="auto"/>
+        <w:numPr>
+          <w:ilvl w:val="0"/>
+          <w:numId w:val="60"/>
+        </w:numPr>
+      </w:pPr>
+      <w:r>
+        <w:rPr>
+          <w:rFonts w:ascii="Malgun Gothic" w:hAnsi="Malgun Gothic" w:eastAsia="Malgun Gothic"/>
+          <w:b w:val="0"/>
+          <w:color w:val="152238"/>
+          <w:sz w:val="21"/>
+        </w:rPr>
+        <w:t>실제 조합원 이름, 주민번호, 연락처와 계좌번호를 가렸는가?</w:t>
+      </w:r>
+    </w:p>
+    <w:p>
+      <w:pPr>
+        <w:spacing w:after="80" w:line="283" w:lineRule="auto"/>
+        <w:numPr>
+          <w:ilvl w:val="0"/>
+          <w:numId w:val="60"/>
+        </w:numPr>
+      </w:pPr>
+      <w:r>
+        <w:rPr>
+          <w:rFonts w:ascii="Malgun Gothic" w:hAnsi="Malgun Gothic" w:eastAsia="Malgun Gothic"/>
+          <w:b w:val="0"/>
+          <w:color w:val="152238"/>
+          <w:sz w:val="21"/>
+        </w:rPr>
+        <w:t>화면의 클릭 위치와 설명의 단계 번호가 일치하는가?</w:t>
+      </w:r>
+    </w:p>
+    <w:p>
+      <w:pPr>
+        <w:spacing w:after="80" w:line="283" w:lineRule="auto"/>
+        <w:numPr>
+          <w:ilvl w:val="0"/>
+          <w:numId w:val="60"/>
+        </w:numPr>
+      </w:pPr>
+      <w:r>
+        <w:rPr>
+          <w:rFonts w:ascii="Malgun Gothic" w:hAnsi="Malgun Gothic" w:eastAsia="Malgun Gothic"/>
+          <w:b w:val="0"/>
+          <w:color w:val="152238"/>
+          <w:sz w:val="21"/>
+        </w:rPr>
+        <w:t>현재 운영 버전의 메뉴명과 선택 상태가 정확한가?</w:t>
+      </w:r>
+    </w:p>
+    <w:p>
+      <w:pPr>
+        <w:spacing w:after="80" w:line="283" w:lineRule="auto"/>
+        <w:numPr>
+          <w:ilvl w:val="0"/>
+          <w:numId w:val="60"/>
+        </w:numPr>
+      </w:pPr>
+      <w:r>
+        <w:rPr>
+          <w:rFonts w:ascii="Malgun Gothic" w:hAnsi="Malgun Gothic" w:eastAsia="Malgun Gothic"/>
+          <w:b w:val="0"/>
+          <w:color w:val="152238"/>
+          <w:sz w:val="21"/>
+        </w:rPr>
+        <w:t>같은 사이드바 이미지를 여러 장에서 중복 사용하지 않았는가?</w:t>
+      </w:r>
+    </w:p>
+    <w:p>
+      <w:pPr>
+        <w:spacing w:after="80" w:line="283" w:lineRule="auto"/>
+        <w:numPr>
+          <w:ilvl w:val="0"/>
+          <w:numId w:val="60"/>
         </w:numPr>
       </w:pPr>
       <w:r>
@@ -11883,8 +12838,8 @@
     <w:multiLevelType w:val="singleLevel"/>
     <w:lvl w:ilvl="0">
       <w:start w:val="1"/>
-      <w:numFmt w:val="decimal"/>
-      <w:lvlText w:val="%1."/>
+      <w:numFmt w:val="bullet"/>
+      <w:lvlText w:val="•"/>
       <w:suff w:val="tab"/>
       <w:pPr>
         <w:tabs>
@@ -11895,6 +12850,51 @@
     </w:lvl>
   </w:abstractNum>
   <w:abstractNum w:abstractNumId="56">
+    <w:multiLevelType w:val="singleLevel"/>
+    <w:lvl w:ilvl="0">
+      <w:start w:val="1"/>
+      <w:numFmt w:val="decimal"/>
+      <w:lvlText w:val="%1."/>
+      <w:suff w:val="tab"/>
+      <w:pPr>
+        <w:tabs>
+          <w:tab w:val="num" w:pos="720"/>
+        </w:tabs>
+        <w:ind w:left="720" w:hanging="360"/>
+      </w:pPr>
+    </w:lvl>
+  </w:abstractNum>
+  <w:abstractNum w:abstractNumId="57">
+    <w:multiLevelType w:val="singleLevel"/>
+    <w:lvl w:ilvl="0">
+      <w:start w:val="1"/>
+      <w:numFmt w:val="decimal"/>
+      <w:lvlText w:val="%1."/>
+      <w:suff w:val="tab"/>
+      <w:pPr>
+        <w:tabs>
+          <w:tab w:val="num" w:pos="720"/>
+        </w:tabs>
+        <w:ind w:left="720" w:hanging="360"/>
+      </w:pPr>
+    </w:lvl>
+  </w:abstractNum>
+  <w:abstractNum w:abstractNumId="58">
+    <w:multiLevelType w:val="singleLevel"/>
+    <w:lvl w:ilvl="0">
+      <w:start w:val="1"/>
+      <w:numFmt w:val="decimal"/>
+      <w:lvlText w:val="%1."/>
+      <w:suff w:val="tab"/>
+      <w:pPr>
+        <w:tabs>
+          <w:tab w:val="num" w:pos="720"/>
+        </w:tabs>
+        <w:ind w:left="720" w:hanging="360"/>
+      </w:pPr>
+    </w:lvl>
+  </w:abstractNum>
+  <w:abstractNum w:abstractNumId="59">
     <w:multiLevelType w:val="singleLevel"/>
     <w:lvl w:ilvl="0">
       <w:start w:val="1"/>
@@ -12220,6 +13220,24 @@
   </w:num>
   <w:num w:numId="57">
     <w:abstractNumId w:val="56"/>
+    <w:lvlOverride w:ilvl="0">
+      <w:startOverride w:val="1"/>
+    </w:lvlOverride>
+  </w:num>
+  <w:num w:numId="58">
+    <w:abstractNumId w:val="57"/>
+    <w:lvlOverride w:ilvl="0">
+      <w:startOverride w:val="1"/>
+    </w:lvlOverride>
+  </w:num>
+  <w:num w:numId="59">
+    <w:abstractNumId w:val="58"/>
+    <w:lvlOverride w:ilvl="0">
+      <w:startOverride w:val="1"/>
+    </w:lvlOverride>
+  </w:num>
+  <w:num w:numId="60">
+    <w:abstractNumId w:val="59"/>
     <w:lvlOverride w:ilvl="0">
       <w:startOverride w:val="1"/>
     </w:lvlOverride>

</xml_diff>